<commit_message>
tidying and fixing code and figures ready for resubmission to journal
</commit_message>
<xml_diff>
--- a/docs/Evidence_use_systematic_map_abstract.docx
+++ b/docs/Evidence_use_systematic_map_abstract.docx
@@ -222,7 +222,7 @@
       </w:r>
       <w:sdt>
         <w:sdtPr>
-          <w:id w:val="-2084254164"/>
+          <w:id w:val="-1347826201"/>
           <w:tag w:val="goog_rdk_0"/>
         </w:sdtPr>
         <w:sdtContent>
@@ -237,7 +237,7 @@
       </w:r>
       <w:sdt>
         <w:sdtPr>
-          <w:id w:val="764175662"/>
+          <w:id w:val="-1229601797"/>
           <w:tag w:val="goog_rdk_1"/>
         </w:sdtPr>
         <w:sdtContent>
@@ -285,7 +285,7 @@
       </w:r>
       <w:sdt>
         <w:sdtPr>
-          <w:id w:val="-1140445830"/>
+          <w:id w:val="-523874022"/>
           <w:tag w:val="goog_rdk_2"/>
         </w:sdtPr>
         <w:sdtContent>
@@ -445,7 +445,115 @@
         <w:rPr>
           <w:rtl w:val="0"/>
         </w:rPr>
-        <w:t xml:space="preserve"> A conservação baseada em evidência tem o potencial de melhorar os resultados para a biodiversidade. No entanto, apesar dos esforços para promover o uso de evidência científica na conservação, muitas decisões para a conservação ainda não sao suportadas desta forma. Para fortalecer o uso de evidência na conservação, é fundamental compreender quais os fatores que influenciam o uso de evidência científica nos processos de tomada de decisão. Embora existam muitos estudos sobre o uso de evidências científicas na tomada de decisões em conservação, ainda não houve uma tentativa abrangente para caracterizar essa literatura.</w:t>
+        <w:t xml:space="preserve"> A conservação baseada em evidência tem o potencial de melhorar os resultados para a biodiversidade. No entanto, apesar dos esforços para promover o uso de evidência científica na conservação, muitas decisões para a conservação ainda não </w:t>
+      </w:r>
+      <w:sdt>
+        <w:sdtPr>
+          <w:id w:val="1773594803"/>
+          <w:tag w:val="goog_rdk_3"/>
+        </w:sdtPr>
+        <w:sdtContent>
+          <w:ins w:author="Cátia Matos" w:id="2" w:date="2026-06-09T13:25:38Z"/>
+          <w:sdt>
+            <w:sdtPr>
+              <w:id w:val="-1325229853"/>
+              <w:tag w:val="goog_rdk_4"/>
+            </w:sdtPr>
+            <w:sdtContent>
+              <w:ins w:author="Cátia Matos" w:id="2" w:date="2026-06-09T13:25:38Z">
+                <w:r>
+                  <w:rPr>
+                    <w:rtl w:val="0"/>
+                    <w:rPrChange w:author="Cátia Matos" w:id="3" w:date="2026-06-09T13:25:38Z">
+                      <w:rPr/>
+                    </w:rPrChange>
+                  </w:rPr>
+                  <w:t xml:space="preserve">são</w:t>
+                </w:r>
+              </w:ins>
+            </w:sdtContent>
+          </w:sdt>
+          <w:ins w:author="Cátia Matos" w:id="2" w:date="2026-06-09T13:25:38Z"/>
+        </w:sdtContent>
+      </w:sdt>
+      <w:sdt>
+        <w:sdtPr>
+          <w:id w:val="-1261797169"/>
+          <w:tag w:val="goog_rdk_5"/>
+        </w:sdtPr>
+        <w:sdtContent>
+          <w:del w:author="Cátia Matos" w:id="2" w:date="2026-06-09T13:25:38Z"/>
+          <w:sdt>
+            <w:sdtPr>
+              <w:id w:val="1795992734"/>
+              <w:tag w:val="goog_rdk_6"/>
+            </w:sdtPr>
+            <w:sdtContent>
+              <w:del w:author="Cátia Matos" w:id="2" w:date="2026-06-09T13:25:38Z">
+                <w:r>
+                  <w:rPr>
+                    <w:rtl w:val="0"/>
+                    <w:rPrChange w:author="Cátia Matos" w:id="3" w:date="2026-06-09T13:25:38Z">
+                      <w:rPr/>
+                    </w:rPrChange>
+                  </w:rPr>
+                  <w:delText xml:space="preserve">sao</w:delText>
+                </w:r>
+              </w:del>
+            </w:sdtContent>
+          </w:sdt>
+          <w:del w:author="Cátia Matos" w:id="2" w:date="2026-06-09T13:25:38Z"/>
+        </w:sdtContent>
+      </w:sdt>
+      <w:r>
+        <w:rPr>
+          <w:rtl w:val="0"/>
+        </w:rPr>
+        <w:t xml:space="preserve"> suportadas desta forma. Para fortalecer o uso de evidência na conservação, é fundamental compreender quais os fatores que influenciam o</w:t>
+      </w:r>
+      <w:sdt>
+        <w:sdtPr>
+          <w:id w:val="790271013"/>
+          <w:tag w:val="goog_rdk_7"/>
+        </w:sdtPr>
+        <w:sdtContent>
+          <w:ins w:author="Cátia Matos" w:id="4" w:date="2026-06-09T13:25:50Z">
+            <w:r>
+              <w:rPr>
+                <w:rtl w:val="0"/>
+              </w:rPr>
+              <w:t xml:space="preserve"> seu</w:t>
+            </w:r>
+          </w:ins>
+        </w:sdtContent>
+      </w:sdt>
+      <w:r>
+        <w:rPr>
+          <w:rtl w:val="0"/>
+        </w:rPr>
+        <w:t xml:space="preserve"> uso </w:t>
+      </w:r>
+      <w:sdt>
+        <w:sdtPr>
+          <w:id w:val="-1629102280"/>
+          <w:tag w:val="goog_rdk_8"/>
+        </w:sdtPr>
+        <w:sdtContent>
+          <w:del w:author="Cátia Matos" w:id="5" w:date="2026-06-09T13:25:55Z">
+            <w:r>
+              <w:rPr>
+                <w:rtl w:val="0"/>
+              </w:rPr>
+              <w:delText xml:space="preserve">de evidência científica </w:delText>
+            </w:r>
+          </w:del>
+        </w:sdtContent>
+      </w:sdt>
+      <w:r>
+        <w:rPr>
+          <w:rtl w:val="0"/>
+        </w:rPr>
+        <w:t xml:space="preserve">nos processos de tomada de decisão. Embora existam muitos estudos sobre o uso de evidências científicas na tomada de decisões em conservação, ainda não houve uma tentativa abrangente para caracterizar essa literatura.</w:t>
       </w:r>
     </w:p>
     <w:p>
@@ -539,7 +647,71 @@
         <w:rPr>
           <w:rtl w:val="0"/>
         </w:rPr>
-        <w:t xml:space="preserve">Em relação aos fatores que influenciam o uso de evidência, os mais frequentemente relatados foram as relações entre cientistas e tomadores de decisão, bem como a capacidade e os recursos das organizações de conservação. Fatores relacionados às características da própria evidência, às características dos profissionais e formuladores de políticas públicas e de suas organizações, e dos contextos de decisão também foram mencionados com frequência. Em contraste, poucos estudos abordaram fatores relacionados aos pesquisadores e às organizações de pesquisa.  </w:t>
+        <w:t xml:space="preserve">Em relação aos fatores que influenciam o uso de evidência, os mais frequentemente relatados foram as relações entre cientistas e tomadores de decisão, bem como a capacidade e os recursos das organizações de conservação. Fatores relacionados às características da própria evidência, às características dos profissionais e formuladores de políticas públicas e de suas organizações, e </w:t>
+      </w:r>
+      <w:sdt>
+        <w:sdtPr>
+          <w:id w:val="1245806883"/>
+          <w:tag w:val="goog_rdk_9"/>
+        </w:sdtPr>
+        <w:sdtContent>
+          <w:ins w:author="Cátia Matos" w:id="6" w:date="2026-06-09T13:26:50Z"/>
+          <w:sdt>
+            <w:sdtPr>
+              <w:id w:val="-1507538796"/>
+              <w:tag w:val="goog_rdk_10"/>
+            </w:sdtPr>
+            <w:sdtContent>
+              <w:ins w:author="Cátia Matos" w:id="6" w:date="2026-06-09T13:26:50Z">
+                <w:r>
+                  <w:rPr>
+                    <w:rtl w:val="0"/>
+                    <w:rPrChange w:author="Cátia Matos" w:id="7" w:date="2026-06-09T13:26:50Z">
+                      <w:rPr/>
+                    </w:rPrChange>
+                  </w:rPr>
+                  <w:t xml:space="preserve">aos</w:t>
+                </w:r>
+              </w:ins>
+            </w:sdtContent>
+          </w:sdt>
+          <w:ins w:author="Cátia Matos" w:id="6" w:date="2026-06-09T13:26:50Z"/>
+        </w:sdtContent>
+      </w:sdt>
+      <w:sdt>
+        <w:sdtPr>
+          <w:id w:val="1923363710"/>
+          <w:tag w:val="goog_rdk_11"/>
+        </w:sdtPr>
+        <w:sdtContent>
+          <w:del w:author="Cátia Matos" w:id="6" w:date="2026-06-09T13:26:50Z"/>
+          <w:sdt>
+            <w:sdtPr>
+              <w:id w:val="948553708"/>
+              <w:tag w:val="goog_rdk_12"/>
+            </w:sdtPr>
+            <w:sdtContent>
+              <w:del w:author="Cátia Matos" w:id="6" w:date="2026-06-09T13:26:50Z">
+                <w:r>
+                  <w:rPr>
+                    <w:rtl w:val="0"/>
+                    <w:rPrChange w:author="Cátia Matos" w:id="7" w:date="2026-06-09T13:26:50Z">
+                      <w:rPr/>
+                    </w:rPrChange>
+                  </w:rPr>
+                  <w:delText xml:space="preserve">dos</w:delText>
+                </w:r>
+              </w:del>
+            </w:sdtContent>
+          </w:sdt>
+          <w:del w:author="Cátia Matos" w:id="6" w:date="2026-06-09T13:26:50Z"/>
+        </w:sdtContent>
+      </w:sdt>
+      <w:r>
+        <w:rPr>
+          <w:rtl w:val="0"/>
+        </w:rPr>
+        <w:t xml:space="preserve"> contextos de decisão também foram mencionados com frequência. Em contraste, poucos estudos abordaram fatores relacionados aos pesquisadores e às organizações de pesquisa.  </w:t>
       </w:r>
     </w:p>
     <w:p>
@@ -8490,7 +8662,7 @@
 
 <file path=customXML/item1.xml><?xml version="1.0" encoding="utf-8"?>
 <go:gDocsCustomXmlDataStorage xmlns:go="http://customooxmlschemas.google.com/" xmlns:r="http://schemas.openxmlformats.org/officeDocument/2006/relationships" uri="GoogleDocsCustomDataVersion2">
-  <go:docsCustomData xmlns:go="http://customooxmlschemas.google.com/" roundtripDataSignature="AMtx7mj4+02DBkJxGhYR+Nf+VNNUELWE+Q==">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</go:docsCustomData>
+  <go:docsCustomData xmlns:go="http://customooxmlschemas.google.com/" roundtripDataSignature="AMtx7mht5vMDnMsu99HRzPydG39Tx0Aayw==">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</go:docsCustomData>
 </go:gDocsCustomXmlDataStorage>
 </file>
 

</xml_diff>

<commit_message>
This version is the one including everything needed for revisions sent to J Applied Ecology
</commit_message>
<xml_diff>
--- a/docs/Evidence_use_systematic_map_abstract.docx
+++ b/docs/Evidence_use_systematic_map_abstract.docx
@@ -220,46 +220,11 @@
         </w:rPr>
         <w:t xml:space="preserve">Las prácticas de conservación basadas en la evidencia científica</w:t>
       </w:r>
-      <w:sdt>
-        <w:sdtPr>
-          <w:id w:val="-1347826201"/>
-          <w:tag w:val="goog_rdk_0"/>
-        </w:sdtPr>
-        <w:sdtContent>
-          <w:commentRangeStart w:id="0"/>
-        </w:sdtContent>
-      </w:sdt>
-      <w:r>
-        <w:rPr>
-          <w:rtl w:val="0"/>
-        </w:rPr>
-        <w:t xml:space="preserve"> tienen el potencial de mejorar los resultados en materia de biodiversidad</w:t>
-      </w:r>
-      <w:sdt>
-        <w:sdtPr>
-          <w:id w:val="-1229601797"/>
-          <w:tag w:val="goog_rdk_1"/>
-        </w:sdtPr>
-        <w:sdtContent>
-          <w:del w:author="Violeta Furlan" w:id="0" w:date="2026-06-05T13:33:02Z">
-            <w:r>
-              <w:rPr>
-                <w:rtl w:val="0"/>
-              </w:rPr>
-              <w:delText xml:space="preserve">s</w:delText>
-            </w:r>
-          </w:del>
-        </w:sdtContent>
-      </w:sdt>
-      <w:r>
-        <w:rPr>
-          <w:rtl w:val="0"/>
-        </w:rPr>
-        <w:t xml:space="preserve">.</w:t>
-      </w:r>
-      <w:commentRangeEnd w:id="0"/>
-      <w:r>
-        <w:commentReference w:id="0"/>
+      <w:r>
+        <w:rPr>
+          <w:rtl w:val="0"/>
+        </w:rPr>
+        <w:t xml:space="preserve"> tienen el potencial de mejorar los resultados en materia de biodiversidad.</w:t>
       </w:r>
       <w:r>
         <w:rPr>
@@ -281,29 +246,7 @@
         <w:rPr>
           <w:rtl w:val="0"/>
         </w:rPr>
-        <w:t xml:space="preserve">Para solventar esta brecha de conocimiento, realizamos un mapeo sistemático de literatura para caracterizar </w:t>
-      </w:r>
-      <w:sdt>
-        <w:sdtPr>
-          <w:id w:val="-523874022"/>
-          <w:tag w:val="goog_rdk_2"/>
-        </w:sdtPr>
-        <w:sdtContent>
-          <w:del w:author="Violeta Furlan" w:id="1" w:date="2026-06-05T13:35:40Z">
-            <w:r>
-              <w:rPr>
-                <w:rtl w:val="0"/>
-              </w:rPr>
-              <w:delText xml:space="preserve">dicha literatura en base a </w:delText>
-            </w:r>
-          </w:del>
-        </w:sdtContent>
-      </w:sdt>
-      <w:r>
-        <w:rPr>
-          <w:rtl w:val="0"/>
-        </w:rPr>
-        <w:t xml:space="preserve">los factores que influyen en el uso de la evidencia en la toma de decisiones en conservación. Se buscó determinar dónde se  han realizado las investigaciones, qué actores han sido objeto de los estudios y qué factores influyen en el uso de la evidencia científica. La  búsqueda bibliográfica y posterior selección permitió identificar 167 estudios relevantes.</w:t>
+        <w:t xml:space="preserve">Para solventar esta brecha de conocimiento, realizamos un mapeo sistemático de literatura para caracterizar los factores que influyen en el uso de la evidencia en la toma de decisiones en conservación. Se buscó determinar dónde se  han realizado las investigaciones, qué actores han sido objeto de los estudios y qué factores influyen en el uso de la evidencia científica. La  búsqueda bibliográfica y posterior selección permitió identificar 167 estudios relevantes.</w:t>
       </w:r>
     </w:p>
     <w:p>
@@ -445,115 +388,7 @@
         <w:rPr>
           <w:rtl w:val="0"/>
         </w:rPr>
-        <w:t xml:space="preserve"> A conservação baseada em evidência tem o potencial de melhorar os resultados para a biodiversidade. No entanto, apesar dos esforços para promover o uso de evidência científica na conservação, muitas decisões para a conservação ainda não </w:t>
-      </w:r>
-      <w:sdt>
-        <w:sdtPr>
-          <w:id w:val="1773594803"/>
-          <w:tag w:val="goog_rdk_3"/>
-        </w:sdtPr>
-        <w:sdtContent>
-          <w:ins w:author="Cátia Matos" w:id="2" w:date="2026-06-09T13:25:38Z"/>
-          <w:sdt>
-            <w:sdtPr>
-              <w:id w:val="-1325229853"/>
-              <w:tag w:val="goog_rdk_4"/>
-            </w:sdtPr>
-            <w:sdtContent>
-              <w:ins w:author="Cátia Matos" w:id="2" w:date="2026-06-09T13:25:38Z">
-                <w:r>
-                  <w:rPr>
-                    <w:rtl w:val="0"/>
-                    <w:rPrChange w:author="Cátia Matos" w:id="3" w:date="2026-06-09T13:25:38Z">
-                      <w:rPr/>
-                    </w:rPrChange>
-                  </w:rPr>
-                  <w:t xml:space="preserve">são</w:t>
-                </w:r>
-              </w:ins>
-            </w:sdtContent>
-          </w:sdt>
-          <w:ins w:author="Cátia Matos" w:id="2" w:date="2026-06-09T13:25:38Z"/>
-        </w:sdtContent>
-      </w:sdt>
-      <w:sdt>
-        <w:sdtPr>
-          <w:id w:val="-1261797169"/>
-          <w:tag w:val="goog_rdk_5"/>
-        </w:sdtPr>
-        <w:sdtContent>
-          <w:del w:author="Cátia Matos" w:id="2" w:date="2026-06-09T13:25:38Z"/>
-          <w:sdt>
-            <w:sdtPr>
-              <w:id w:val="1795992734"/>
-              <w:tag w:val="goog_rdk_6"/>
-            </w:sdtPr>
-            <w:sdtContent>
-              <w:del w:author="Cátia Matos" w:id="2" w:date="2026-06-09T13:25:38Z">
-                <w:r>
-                  <w:rPr>
-                    <w:rtl w:val="0"/>
-                    <w:rPrChange w:author="Cátia Matos" w:id="3" w:date="2026-06-09T13:25:38Z">
-                      <w:rPr/>
-                    </w:rPrChange>
-                  </w:rPr>
-                  <w:delText xml:space="preserve">sao</w:delText>
-                </w:r>
-              </w:del>
-            </w:sdtContent>
-          </w:sdt>
-          <w:del w:author="Cátia Matos" w:id="2" w:date="2026-06-09T13:25:38Z"/>
-        </w:sdtContent>
-      </w:sdt>
-      <w:r>
-        <w:rPr>
-          <w:rtl w:val="0"/>
-        </w:rPr>
-        <w:t xml:space="preserve"> suportadas desta forma. Para fortalecer o uso de evidência na conservação, é fundamental compreender quais os fatores que influenciam o</w:t>
-      </w:r>
-      <w:sdt>
-        <w:sdtPr>
-          <w:id w:val="790271013"/>
-          <w:tag w:val="goog_rdk_7"/>
-        </w:sdtPr>
-        <w:sdtContent>
-          <w:ins w:author="Cátia Matos" w:id="4" w:date="2026-06-09T13:25:50Z">
-            <w:r>
-              <w:rPr>
-                <w:rtl w:val="0"/>
-              </w:rPr>
-              <w:t xml:space="preserve"> seu</w:t>
-            </w:r>
-          </w:ins>
-        </w:sdtContent>
-      </w:sdt>
-      <w:r>
-        <w:rPr>
-          <w:rtl w:val="0"/>
-        </w:rPr>
-        <w:t xml:space="preserve"> uso </w:t>
-      </w:r>
-      <w:sdt>
-        <w:sdtPr>
-          <w:id w:val="-1629102280"/>
-          <w:tag w:val="goog_rdk_8"/>
-        </w:sdtPr>
-        <w:sdtContent>
-          <w:del w:author="Cátia Matos" w:id="5" w:date="2026-06-09T13:25:55Z">
-            <w:r>
-              <w:rPr>
-                <w:rtl w:val="0"/>
-              </w:rPr>
-              <w:delText xml:space="preserve">de evidência científica </w:delText>
-            </w:r>
-          </w:del>
-        </w:sdtContent>
-      </w:sdt>
-      <w:r>
-        <w:rPr>
-          <w:rtl w:val="0"/>
-        </w:rPr>
-        <w:t xml:space="preserve">nos processos de tomada de decisão. Embora existam muitos estudos sobre o uso de evidências científicas na tomada de decisões em conservação, ainda não houve uma tentativa abrangente para caracterizar essa literatura.</w:t>
+        <w:t xml:space="preserve"> A conservação baseada em evidência tem o potencial de melhorar os resultados para a biodiversidade. No entanto, apesar dos esforços para promover o uso de evidência científica na conservação, muitas decisões para a conservação ainda não são suportadas desta forma. Para fortalecer o uso de evidência na conservação, é fundamental compreender quais os fatores que influenciam o seu uso nos processos de tomada de decisão. Embora existam muitos estudos sobre o uso de evidências científicas na tomada de decisões em conservação, ainda não houve uma tentativa abrangente para caracterizar essa literatura.</w:t>
       </w:r>
     </w:p>
     <w:p>
@@ -647,71 +482,7 @@
         <w:rPr>
           <w:rtl w:val="0"/>
         </w:rPr>
-        <w:t xml:space="preserve">Em relação aos fatores que influenciam o uso de evidência, os mais frequentemente relatados foram as relações entre cientistas e tomadores de decisão, bem como a capacidade e os recursos das organizações de conservação. Fatores relacionados às características da própria evidência, às características dos profissionais e formuladores de políticas públicas e de suas organizações, e </w:t>
-      </w:r>
-      <w:sdt>
-        <w:sdtPr>
-          <w:id w:val="1245806883"/>
-          <w:tag w:val="goog_rdk_9"/>
-        </w:sdtPr>
-        <w:sdtContent>
-          <w:ins w:author="Cátia Matos" w:id="6" w:date="2026-06-09T13:26:50Z"/>
-          <w:sdt>
-            <w:sdtPr>
-              <w:id w:val="-1507538796"/>
-              <w:tag w:val="goog_rdk_10"/>
-            </w:sdtPr>
-            <w:sdtContent>
-              <w:ins w:author="Cátia Matos" w:id="6" w:date="2026-06-09T13:26:50Z">
-                <w:r>
-                  <w:rPr>
-                    <w:rtl w:val="0"/>
-                    <w:rPrChange w:author="Cátia Matos" w:id="7" w:date="2026-06-09T13:26:50Z">
-                      <w:rPr/>
-                    </w:rPrChange>
-                  </w:rPr>
-                  <w:t xml:space="preserve">aos</w:t>
-                </w:r>
-              </w:ins>
-            </w:sdtContent>
-          </w:sdt>
-          <w:ins w:author="Cátia Matos" w:id="6" w:date="2026-06-09T13:26:50Z"/>
-        </w:sdtContent>
-      </w:sdt>
-      <w:sdt>
-        <w:sdtPr>
-          <w:id w:val="1923363710"/>
-          <w:tag w:val="goog_rdk_11"/>
-        </w:sdtPr>
-        <w:sdtContent>
-          <w:del w:author="Cátia Matos" w:id="6" w:date="2026-06-09T13:26:50Z"/>
-          <w:sdt>
-            <w:sdtPr>
-              <w:id w:val="948553708"/>
-              <w:tag w:val="goog_rdk_12"/>
-            </w:sdtPr>
-            <w:sdtContent>
-              <w:del w:author="Cátia Matos" w:id="6" w:date="2026-06-09T13:26:50Z">
-                <w:r>
-                  <w:rPr>
-                    <w:rtl w:val="0"/>
-                    <w:rPrChange w:author="Cátia Matos" w:id="7" w:date="2026-06-09T13:26:50Z">
-                      <w:rPr/>
-                    </w:rPrChange>
-                  </w:rPr>
-                  <w:delText xml:space="preserve">dos</w:delText>
-                </w:r>
-              </w:del>
-            </w:sdtContent>
-          </w:sdt>
-          <w:del w:author="Cátia Matos" w:id="6" w:date="2026-06-09T13:26:50Z"/>
-        </w:sdtContent>
-      </w:sdt>
-      <w:r>
-        <w:rPr>
-          <w:rtl w:val="0"/>
-        </w:rPr>
-        <w:t xml:space="preserve"> contextos de decisão também foram mencionados com frequência. Em contraste, poucos estudos abordaram fatores relacionados aos pesquisadores e às organizações de pesquisa.  </w:t>
+        <w:t xml:space="preserve">Em relação aos fatores que influenciam o uso de evidência, os mais frequentemente relatados foram as relações entre cientistas e tomadores de decisão, bem como a capacidade e os recursos das organizações de conservação. Fatores relacionados às características da própria evidência, às características dos profissionais e formuladores de políticas públicas e de suas organizações, e aos contextos de decisão também foram mencionados com frequência. Em contraste, poucos estudos abordaram fatores relacionados aos pesquisadores e às organizações de pesquisa.  </w:t>
       </w:r>
     </w:p>
     <w:p>
@@ -1322,21 +1093,384 @@
         <w:t xml:space="preserve">Basque version (Eñaut)</w:t>
       </w:r>
     </w:p>
-    <w:p>
-      <w:pPr>
-        <w:spacing w:line="480" w:lineRule="auto"/>
-        <w:rPr>
-          <w:b w:val="1"/>
-          <w:bCs w:val="1"/>
-          <w:u w:val="single"/>
-        </w:rPr>
-      </w:pPr>
-      <w:r>
-        <w:rPr>
-          <w:rtl w:val="0"/>
-        </w:rPr>
-      </w:r>
-    </w:p>
+    <w:sdt>
+      <w:sdtPr>
+        <w:id w:val="-162622638"/>
+        <w:tag w:val="goog_rdk_5"/>
+      </w:sdtPr>
+      <w:sdtContent>
+        <w:p>
+          <w:pPr>
+            <w:numPr>
+              <w:ilvl w:val="0"/>
+              <w:numId w:val="4"/>
+            </w:numPr>
+            <w:spacing w:line="480" w:lineRule="auto"/>
+            <w:ind w:left="720" w:hanging="360"/>
+            <w:rPr>
+              <w:ins w:author="Eñaut Martínez de Birgara" w:id="0" w:date="2026-06-25T09:10:46Z"/>
+            </w:rPr>
+          </w:pPr>
+          <w:sdt>
+            <w:sdtPr>
+              <w:id w:val="260127965"/>
+              <w:tag w:val="goog_rdk_1"/>
+            </w:sdtPr>
+            <w:sdtContent>
+              <w:ins w:author="Eñaut Martínez de Birgara" w:id="0" w:date="2026-06-25T09:10:46Z"/>
+              <w:sdt>
+                <w:sdtPr>
+                  <w:id w:val="1004112668"/>
+                  <w:tag w:val="goog_rdk_2"/>
+                </w:sdtPr>
+                <w:sdtContent>
+                  <w:ins w:author="Eñaut Martínez de Birgara" w:id="0" w:date="2026-06-25T09:10:46Z">
+                    <w:r>
+                      <w:rPr>
+                        <w:rtl w:val="0"/>
+                        <w:rPrChange w:author="Eñaut Martínez de Birgara" w:id="1" w:date="2026-06-25T09:10:46Z">
+                          <w:rPr>
+                            <w:b w:val="1"/>
+                            <w:bCs w:val="1"/>
+                            <w:u w:val="single"/>
+                          </w:rPr>
+                        </w:rPrChange>
+                      </w:rPr>
+                      <w:t xml:space="preserve">Ebidentzian oinarrituriko kontserbazioak biodibertsitate emaitzak hobetzeko potentziala du. Hala ere, kontserbazioan ebidentzia zientifikoaren erabilera emendatzeko ahaleginak egin arren, kontserbazio erabaki askok ez dute kontuan hartzen. Kontserbazioan e</w:t>
+                    </w:r>
+                  </w:ins>
+                </w:sdtContent>
+              </w:sdt>
+              <w:ins w:author="Eñaut Martínez de Birgara" w:id="0" w:date="2026-06-25T09:10:46Z">
+                <w:sdt>
+                  <w:sdtPr>
+                    <w:id w:val="1811376776"/>
+                    <w:tag w:val="goog_rdk_3"/>
+                  </w:sdtPr>
+                  <w:sdtContent>
+                    <w:r>
+                      <w:rPr>
+                        <w:rtl w:val="0"/>
+                        <w:rPrChange w:author="Eñaut Martínez de Birgara" w:id="1" w:date="2026-06-25T09:10:46Z">
+                          <w:rPr>
+                            <w:b w:val="1"/>
+                            <w:bCs w:val="1"/>
+                            <w:u w:val="single"/>
+                          </w:rPr>
+                        </w:rPrChange>
+                      </w:rPr>
+                      <w:t xml:space="preserve">bidentziaren erabilera bultzatzeko, ezinbestekoa da ulertzea zein faktorek eragiten duten erabaki hartzean ebidentzia zientifikoa erabiltzea. Nahiz eta kontserbaziorako erabaki hartzean ebidentzia zientifikoaren erabileraren inguruan hainbat ikerketa egon, ez da saiakera sakonik egin literatura hori ezaugarritzeko.</w:t>
+                    </w:r>
+                  </w:sdtContent>
+                </w:sdt>
+                <w:sdt>
+                  <w:sdtPr>
+                    <w:id w:val="210820396"/>
+                    <w:tag w:val="goog_rdk_4"/>
+                  </w:sdtPr>
+                  <w:sdtContent>
+                    <w:r>
+                      <w:rPr>
+                        <w:rtl w:val="0"/>
+                      </w:rPr>
+                    </w:r>
+                  </w:sdtContent>
+                </w:sdt>
+              </w:ins>
+            </w:sdtContent>
+          </w:sdt>
+        </w:p>
+      </w:sdtContent>
+    </w:sdt>
+    <w:sdt>
+      <w:sdtPr>
+        <w:id w:val="694414170"/>
+        <w:tag w:val="goog_rdk_8"/>
+      </w:sdtPr>
+      <w:sdtContent>
+        <w:p>
+          <w:pPr>
+            <w:numPr>
+              <w:ilvl w:val="0"/>
+              <w:numId w:val="4"/>
+            </w:numPr>
+            <w:spacing w:line="480" w:lineRule="auto"/>
+            <w:ind w:left="720" w:hanging="360"/>
+            <w:rPr>
+              <w:ins w:author="Eñaut Martínez de Birgara" w:id="0" w:date="2026-06-25T09:10:46Z"/>
+            </w:rPr>
+          </w:pPr>
+          <w:sdt>
+            <w:sdtPr>
+              <w:id w:val="551739752"/>
+              <w:tag w:val="goog_rdk_6"/>
+            </w:sdtPr>
+            <w:sdtContent>
+              <w:ins w:author="Eñaut Martínez de Birgara" w:id="0" w:date="2026-06-25T09:10:46Z"/>
+              <w:sdt>
+                <w:sdtPr>
+                  <w:id w:val="995325027"/>
+                  <w:tag w:val="goog_rdk_7"/>
+                </w:sdtPr>
+                <w:sdtContent>
+                  <w:ins w:author="Eñaut Martínez de Birgara" w:id="0" w:date="2026-06-25T09:10:46Z">
+                    <w:r>
+                      <w:rPr>
+                        <w:rtl w:val="0"/>
+                        <w:rPrChange w:author="Eñaut Martínez de Birgara" w:id="1" w:date="2026-06-25T09:10:46Z">
+                          <w:rPr>
+                            <w:b w:val="1"/>
+                            <w:bCs w:val="1"/>
+                            <w:u w:val="single"/>
+                          </w:rPr>
+                        </w:rPrChange>
+                      </w:rPr>
+                      <w:t xml:space="preserve">Ezagutza hutsune hori betetzeko, mapa sistematiko bat burutu genuen kontserbaziorako erabaki hartzean ebidentziaren erabileran eragiten duten faktoreen inguruko literatura ezaugarritzeko eta ikerketak non burutu diren, fokuan zein aktore izan dituzten eta ebidentzia zientifikoaren erabileran zein faktorek eragin duten identifikatzeko. Gure bilaketak eta miaketak 167 ikerketa esanguratsu identifikatu zituen.</w:t>
+                    </w:r>
+                  </w:ins>
+                </w:sdtContent>
+              </w:sdt>
+              <w:ins w:author="Eñaut Martínez de Birgara" w:id="0" w:date="2026-06-25T09:10:46Z"/>
+            </w:sdtContent>
+          </w:sdt>
+        </w:p>
+      </w:sdtContent>
+    </w:sdt>
+    <w:sdt>
+      <w:sdtPr>
+        <w:id w:val="-1832573759"/>
+        <w:tag w:val="goog_rdk_12"/>
+      </w:sdtPr>
+      <w:sdtContent>
+        <w:p>
+          <w:pPr>
+            <w:numPr>
+              <w:ilvl w:val="0"/>
+              <w:numId w:val="4"/>
+            </w:numPr>
+            <w:spacing w:line="480" w:lineRule="auto"/>
+            <w:ind w:left="720" w:hanging="360"/>
+            <w:rPr>
+              <w:ins w:author="Eñaut Martínez de Birgara" w:id="0" w:date="2026-06-25T09:10:46Z"/>
+            </w:rPr>
+          </w:pPr>
+          <w:sdt>
+            <w:sdtPr>
+              <w:id w:val="933026823"/>
+              <w:tag w:val="goog_rdk_9"/>
+            </w:sdtPr>
+            <w:sdtContent>
+              <w:ins w:author="Eñaut Martínez de Birgara" w:id="0" w:date="2026-06-25T09:10:46Z"/>
+              <w:sdt>
+                <w:sdtPr>
+                  <w:id w:val="-1992121021"/>
+                  <w:tag w:val="goog_rdk_10"/>
+                </w:sdtPr>
+                <w:sdtContent>
+                  <w:ins w:author="Eñaut Martínez de Birgara" w:id="0" w:date="2026-06-25T09:10:46Z">
+                    <w:r>
+                      <w:rPr>
+                        <w:rtl w:val="0"/>
+                        <w:rPrChange w:author="Eñaut Martínez de Birgara" w:id="1" w:date="2026-06-25T09:10:46Z">
+                          <w:rPr>
+                            <w:b w:val="1"/>
+                            <w:bCs w:val="1"/>
+                            <w:u w:val="single"/>
+                          </w:rPr>
+                        </w:rPrChange>
+                      </w:rPr>
+                      <w:t xml:space="preserve">Herrialde Ingeles-hiztunetarako joera sendoa identifikatu genuen ebidentzien literaturan. </w:t>
+                    </w:r>
+                  </w:ins>
+                </w:sdtContent>
+              </w:sdt>
+              <w:ins w:author="Eñaut Martínez de Birgara" w:id="0" w:date="2026-06-25T09:10:46Z">
+                <w:sdt>
+                  <w:sdtPr>
+                    <w:id w:val="-1591604207"/>
+                    <w:tag w:val="goog_rdk_11"/>
+                  </w:sdtPr>
+                  <w:sdtContent>
+                    <w:r>
+                      <w:rPr>
+                        <w:rtl w:val="0"/>
+                        <w:rPrChange w:author="Eñaut Martínez de Birgara" w:id="1" w:date="2026-06-25T09:10:46Z">
+                          <w:rPr>
+                            <w:b w:val="1"/>
+                            <w:bCs w:val="1"/>
+                            <w:u w:val="single"/>
+                          </w:rPr>
+                        </w:rPrChange>
+                      </w:rPr>
+                      <w:t xml:space="preserve">Ikerketa gutxik aurkezten zituzten ikerturiko ekosistema mota, talde taxonomikoa edota mehatxu zehatzak eta egiten zutenak itsas, baso edo ur-gezako sistemetan egiten zuten. Ikerketa gehienek azterturiko aktoreak ikertzaileak eta profesionalak izan ziren, legegileak edo bestelako aktoreak aztertzen zituzten ikerketa kopurua erlatiboki murritza zen bitartean.</w:t>
+                    </w:r>
+                  </w:sdtContent>
+                </w:sdt>
+              </w:ins>
+            </w:sdtContent>
+          </w:sdt>
+        </w:p>
+      </w:sdtContent>
+    </w:sdt>
+    <w:sdt>
+      <w:sdtPr>
+        <w:id w:val="-1297760587"/>
+        <w:tag w:val="goog_rdk_15"/>
+      </w:sdtPr>
+      <w:sdtContent>
+        <w:p>
+          <w:pPr>
+            <w:numPr>
+              <w:ilvl w:val="0"/>
+              <w:numId w:val="4"/>
+            </w:numPr>
+            <w:spacing w:line="480" w:lineRule="auto"/>
+            <w:ind w:left="720" w:hanging="360"/>
+            <w:rPr>
+              <w:ins w:author="Eñaut Martínez de Birgara" w:id="0" w:date="2026-06-25T09:10:46Z"/>
+              <w:u w:val="none"/>
+            </w:rPr>
+          </w:pPr>
+          <w:sdt>
+            <w:sdtPr>
+              <w:id w:val="-855060999"/>
+              <w:tag w:val="goog_rdk_13"/>
+            </w:sdtPr>
+            <w:sdtContent>
+              <w:ins w:author="Eñaut Martínez de Birgara" w:id="0" w:date="2026-06-25T09:10:46Z"/>
+              <w:sdt>
+                <w:sdtPr>
+                  <w:id w:val="-1482888527"/>
+                  <w:tag w:val="goog_rdk_14"/>
+                </w:sdtPr>
+                <w:sdtContent>
+                  <w:ins w:author="Eñaut Martínez de Birgara" w:id="0" w:date="2026-06-25T09:10:46Z">
+                    <w:r>
+                      <w:rPr>
+                        <w:rtl w:val="0"/>
+                        <w:rPrChange w:author="Eñaut Martínez de Birgara" w:id="1" w:date="2026-06-25T09:10:46Z">
+                          <w:rPr>
+                            <w:b w:val="1"/>
+                            <w:bCs w:val="1"/>
+                            <w:u w:val="single"/>
+                          </w:rPr>
+                        </w:rPrChange>
+                      </w:rPr>
+                      <w:t xml:space="preserve">Ebidentziaren erabileran eragiten duten faktoreei dagokionez, erabaki hartzaileen eta zientzialarien arteko harremanak eta kontserbazio erakundeen gaitasun zein baliabideak izan ziren gehien aipaturikoak. Ebidentziaren beraren ezaugarriei eta profesional/legegileen, euren erakundeen eta erabakien testuinguruaren ezaugarriei zegozkien faktoreak maiz agertzen ziren baina ikerketa gutxik heltzen zien ikertzaileei zein ikerketa erakundeei loturiko faktoreei. </w:t>
+                    </w:r>
+                  </w:ins>
+                </w:sdtContent>
+              </w:sdt>
+              <w:ins w:author="Eñaut Martínez de Birgara" w:id="0" w:date="2026-06-25T09:10:46Z"/>
+            </w:sdtContent>
+          </w:sdt>
+        </w:p>
+      </w:sdtContent>
+    </w:sdt>
+    <w:sdt>
+      <w:sdtPr>
+        <w:id w:val="-144515860"/>
+        <w:tag w:val="goog_rdk_20"/>
+      </w:sdtPr>
+      <w:sdtContent>
+        <w:p>
+          <w:pPr>
+            <w:numPr>
+              <w:ilvl w:val="0"/>
+              <w:numId w:val="4"/>
+            </w:numPr>
+            <w:spacing w:line="480" w:lineRule="auto"/>
+            <w:ind w:left="720" w:hanging="360"/>
+            <w:rPr>
+              <w:i w:val="1"/>
+              <w:iCs w:val="1"/>
+              <w:rPrChange w:author="Eñaut Martínez de Birgara" w:id="1" w:date="2026-06-25T09:10:46Z">
+                <w:rPr>
+                  <w:b w:val="1"/>
+                  <w:bCs w:val="1"/>
+                  <w:u w:val="single"/>
+                </w:rPr>
+              </w:rPrChange>
+            </w:rPr>
+            <w:pPrChange w:author="Eñaut Martínez de Birgara" w:id="0" w:date="2026-06-25T09:10:46Z">
+              <w:pPr>
+                <w:spacing w:line="480" w:lineRule="auto"/>
+              </w:pPr>
+            </w:pPrChange>
+          </w:pPr>
+          <w:sdt>
+            <w:sdtPr>
+              <w:id w:val="433794757"/>
+              <w:tag w:val="goog_rdk_16"/>
+            </w:sdtPr>
+            <w:sdtContent>
+              <w:ins w:author="Eñaut Martínez de Birgara" w:id="0" w:date="2026-06-25T09:10:46Z"/>
+              <w:sdt>
+                <w:sdtPr>
+                  <w:id w:val="1794541642"/>
+                  <w:tag w:val="goog_rdk_17"/>
+                </w:sdtPr>
+                <w:sdtContent>
+                  <w:ins w:author="Eñaut Martínez de Birgara" w:id="0" w:date="2026-06-25T09:10:46Z">
+                    <w:r>
+                      <w:rPr>
+                        <w:i w:val="1"/>
+                        <w:iCs w:val="1"/>
+                        <w:rtl w:val="0"/>
+                        <w:rPrChange w:author="Eñaut Martínez de Birgara" w:id="1" w:date="2026-06-25T09:10:46Z">
+                          <w:rPr>
+                            <w:b w:val="1"/>
+                            <w:bCs w:val="1"/>
+                            <w:u w:val="single"/>
+                          </w:rPr>
+                        </w:rPrChange>
+                      </w:rPr>
+                      <w:t xml:space="preserve">Sintesia eta aplikazioak.</w:t>
+                    </w:r>
+                  </w:ins>
+                </w:sdtContent>
+              </w:sdt>
+              <w:ins w:author="Eñaut Martínez de Birgara" w:id="0" w:date="2026-06-25T09:10:46Z">
+                <w:sdt>
+                  <w:sdtPr>
+                    <w:id w:val="155385502"/>
+                    <w:tag w:val="goog_rdk_18"/>
+                  </w:sdtPr>
+                  <w:sdtContent>
+                    <w:r>
+                      <w:rPr>
+                        <w:rtl w:val="0"/>
+                        <w:rPrChange w:author="Eñaut Martínez de Birgara" w:id="1" w:date="2026-06-25T09:10:46Z">
+                          <w:rPr>
+                            <w:b w:val="1"/>
+                            <w:bCs w:val="1"/>
+                            <w:u w:val="single"/>
+                          </w:rPr>
+                        </w:rPrChange>
+                      </w:rPr>
+                      <w:t xml:space="preserve"> Ikertzaileek igaro beharko lukete kontserbazio erabakietan ebidentzia zientifikoaren erabileran eragiten duten faktoreak ezaugarritzetik, interbentzioak identifikatu eta probatzera. Faktore horiek elkarlotuta egonda, askotariko oztopoei aurre egingo lioketen ekintzen inplementazioa eta probatzea lehenetsi beharko lirateke. Erabaki hartzaileek ikertzaileekin ahal eta arinen egin beharko lukete bat kudeaketa eta politiken inguruko galderak definitzerakoan, ezagutza beharrak argiki artikulatu eta, posible denean, elkarrizketa eta ebidentziaren interpretazioa erraztuko dituen mekanismoetan inbertitu. Hurbiltze horiek, batera, ebidentzian oinarrituriko kontserbazio praktikak eta politikak sustatzeko potentziala dute, biodibertsitate emaitzak hobetuz.</w:t>
+                    </w:r>
+                  </w:sdtContent>
+                </w:sdt>
+              </w:ins>
+            </w:sdtContent>
+          </w:sdt>
+          <w:sdt>
+            <w:sdtPr>
+              <w:id w:val="-350384239"/>
+              <w:tag w:val="goog_rdk_19"/>
+            </w:sdtPr>
+            <w:sdtContent>
+              <w:r>
+                <w:rPr>
+                  <w:rtl w:val="0"/>
+                </w:rPr>
+              </w:r>
+            </w:sdtContent>
+          </w:sdt>
+        </w:p>
+      </w:sdtContent>
+    </w:sdt>
     <w:p>
       <w:pPr>
         <w:spacing w:line="480" w:lineRule="auto"/>
@@ -7781,72 +7915,6 @@
 </w:document>
 </file>
 
-<file path=word/comments.xml><?xml version="1.0" encoding="utf-8"?>
-<w:comments xmlns:mc="http://schemas.openxmlformats.org/markup-compatibility/2006" xmlns:o="urn:schemas-microsoft-com:office:office" xmlns:r="http://schemas.openxmlformats.org/officeDocument/2006/relationships" xmlns:m="http://schemas.openxmlformats.org/officeDocument/2006/math" xmlns:v="urn:schemas-microsoft-com:vml" xmlns:wp="http://schemas.openxmlformats.org/drawingml/2006/wordprocessingDrawing" xmlns:w10="urn:schemas-microsoft-com:office:word" xmlns:w="http://schemas.openxmlformats.org/wordprocessingml/2006/main" xmlns:wne="http://schemas.microsoft.com/office/word/2006/wordml" xmlns:sl="http://schemas.openxmlformats.org/schemaLibrary/2006/main" xmlns:a="http://schemas.openxmlformats.org/drawingml/2006/main" xmlns:pic="http://schemas.openxmlformats.org/drawingml/2006/picture" xmlns:c="http://schemas.openxmlformats.org/drawingml/2006/chart" xmlns:lc="http://schemas.openxmlformats.org/drawingml/2006/lockedCanvas" xmlns:dgm="http://schemas.openxmlformats.org/drawingml/2006/diagram" xmlns:wps="http://schemas.microsoft.com/office/word/2010/wordprocessingShape" xmlns:wpg="http://schemas.microsoft.com/office/word/2010/wordprocessingGroup" xmlns:w14="http://schemas.microsoft.com/office/word/2010/wordml" xmlns:w15="http://schemas.microsoft.com/office/word/2012/wordml" xmlns:w16="http://schemas.microsoft.com/office/word/2018/wordml" xmlns:w16cex="http://schemas.microsoft.com/office/word/2018/wordml/cex" xmlns:w16cid="http://schemas.microsoft.com/office/word/2016/wordml/cid" xmlns="http://schemas.microsoft.com/office/tasks/2019/documenttasks" xmlns:cr="http://schemas.microsoft.com/office/comments/2020/reactions">
-  <w:comment w:author="Santiago Perea Arroyo" w:id="0" w:date="2026-06-04T21:57:11Z">
-    <w:p>
-      <w:pPr>
-        <w:keepNext w:val="0"/>
-        <w:keepLines w:val="0"/>
-        <w:pageBreakBefore w:val="0"/>
-        <w:widowControl w:val="0"/>
-        <w:pBdr>
-          <w:top w:space="0" w:sz="0" w:val="nil"/>
-          <w:left w:space="0" w:sz="0" w:val="nil"/>
-          <w:bottom w:space="0" w:sz="0" w:val="nil"/>
-          <w:right w:space="0" w:sz="0" w:val="nil"/>
-          <w:between w:space="0" w:sz="0" w:val="nil"/>
-        </w:pBdr>
-        <w:shd w:fill="auto" w:val="clear"/>
-        <w:spacing w:after="0" w:before="0" w:line="240" w:lineRule="auto"/>
-        <w:ind w:left="0" w:right="0" w:firstLine="0"/>
-        <w:jc w:val="left"/>
-        <w:rPr>
-          <w:rFonts w:ascii="Arial" w:cs="Arial" w:eastAsia="Arial" w:hAnsi="Arial"/>
-          <w:b w:val="0"/>
-          <w:bCs w:val="0"/>
-          <w:i w:val="0"/>
-          <w:iCs w:val="0"/>
-          <w:smallCaps w:val="0"/>
-          <w:strike w:val="0"/>
-          <w:color w:val="000000"/>
-          <w:sz w:val="22"/>
-          <w:szCs w:val="22"/>
-          <w:u w:val="none"/>
-          <w:shd w:fill="auto" w:val="clear"/>
-          <w:vertAlign w:val="baseline"/>
-        </w:rPr>
-      </w:pPr>
-      <w:r>
-        <w:rPr>
-          <w:rFonts w:ascii="Arial" w:cs="Arial" w:eastAsia="Arial" w:hAnsi="Arial"/>
-          <w:b w:val="0"/>
-          <w:bCs w:val="0"/>
-          <w:i w:val="0"/>
-          <w:iCs w:val="0"/>
-          <w:smallCaps w:val="0"/>
-          <w:strike w:val="0"/>
-          <w:color w:val="000000"/>
-          <w:sz w:val="22"/>
-          <w:szCs w:val="22"/>
-          <w:u w:val="none"/>
-          <w:shd w:fill="auto" w:val="clear"/>
-          <w:vertAlign w:val="baseline"/>
-          <w:rtl w:val="0"/>
-        </w:rPr>
-        <w:t xml:space="preserve">or "tienen el potencial de mejorar los resultados en materia de biodiversidad." biodiversity is not improved itself</w:t>
-      </w:r>
-    </w:p>
-  </w:comment>
-</w:comments>
-</file>
-
-<file path=word/commentsExtended.xml><?xml version="1.0" encoding="utf-8"?>
-<w15:commentsEx xmlns:mc="http://schemas.openxmlformats.org/markup-compatibility/2006" xmlns:o="urn:schemas-microsoft-com:office:office" xmlns:r="http://schemas.openxmlformats.org/officeDocument/2006/relationships" xmlns:m="http://schemas.openxmlformats.org/officeDocument/2006/math" xmlns:v="urn:schemas-microsoft-com:vml" xmlns:wp="http://schemas.openxmlformats.org/drawingml/2006/wordprocessingDrawing" xmlns:w10="urn:schemas-microsoft-com:office:word" xmlns:w="http://schemas.openxmlformats.org/wordprocessingml/2006/main" xmlns:wne="http://schemas.microsoft.com/office/word/2006/wordml" xmlns:sl="http://schemas.openxmlformats.org/schemaLibrary/2006/main" xmlns:a="http://schemas.openxmlformats.org/drawingml/2006/main" xmlns:pic="http://schemas.openxmlformats.org/drawingml/2006/picture" xmlns:c="http://schemas.openxmlformats.org/drawingml/2006/chart" xmlns:lc="http://schemas.openxmlformats.org/drawingml/2006/lockedCanvas" xmlns:dgm="http://schemas.openxmlformats.org/drawingml/2006/diagram" xmlns:wps="http://schemas.microsoft.com/office/word/2010/wordprocessingShape" xmlns:wpg="http://schemas.microsoft.com/office/word/2010/wordprocessingGroup" xmlns:w14="http://schemas.microsoft.com/office/word/2010/wordml" xmlns:w15="http://schemas.microsoft.com/office/word/2012/wordml" xmlns:w16="http://schemas.microsoft.com/office/word/2018/wordml" xmlns:w16cex="http://schemas.microsoft.com/office/word/2018/wordml/cex" xmlns:w16cid="http://schemas.microsoft.com/office/word/2016/wordml/cid" xmlns="http://schemas.microsoft.com/office/tasks/2019/documenttasks" xmlns:cr="http://schemas.microsoft.com/office/comments/2020/reactions">
-  <w15:commentEx w15:paraId="00000053" w15:done="0"/>
-</w15:commentsEx>
-</file>
-
 <file path=word/numbering.xml><?xml version="1.0" encoding="utf-8"?>
 <w:numbering xmlns:mc="http://schemas.openxmlformats.org/markup-compatibility/2006" xmlns:o="urn:schemas-microsoft-com:office:office" xmlns:r="http://schemas.openxmlformats.org/officeDocument/2006/relationships" xmlns:m="http://schemas.openxmlformats.org/officeDocument/2006/math" xmlns:v="urn:schemas-microsoft-com:vml" xmlns:wp="http://schemas.openxmlformats.org/drawingml/2006/wordprocessingDrawing" xmlns:w10="urn:schemas-microsoft-com:office:word" xmlns:w="http://schemas.openxmlformats.org/wordprocessingml/2006/main" xmlns:wne="http://schemas.microsoft.com/office/word/2006/wordml" xmlns:sl="http://schemas.openxmlformats.org/schemaLibrary/2006/main" xmlns:a="http://schemas.openxmlformats.org/drawingml/2006/main" xmlns:pic="http://schemas.openxmlformats.org/drawingml/2006/picture" xmlns:c="http://schemas.openxmlformats.org/drawingml/2006/chart" xmlns:lc="http://schemas.openxmlformats.org/drawingml/2006/lockedCanvas" xmlns:dgm="http://schemas.openxmlformats.org/drawingml/2006/diagram" xmlns:wps="http://schemas.microsoft.com/office/word/2010/wordprocessingShape" xmlns:wpg="http://schemas.microsoft.com/office/word/2010/wordprocessingGroup" xmlns:w14="http://schemas.microsoft.com/office/word/2010/wordml" xmlns:w15="http://schemas.microsoft.com/office/word/2012/wordml" xmlns:w16="http://schemas.microsoft.com/office/word/2018/wordml" xmlns:w16cex="http://schemas.microsoft.com/office/word/2018/wordml/cex" xmlns:w16cid="http://schemas.microsoft.com/office/word/2016/wordml/cid" xmlns="http://schemas.microsoft.com/office/tasks/2019/documenttasks" xmlns:cr="http://schemas.microsoft.com/office/comments/2020/reactions">
   <w:abstractNum w:abstractNumId="1">
@@ -8070,6 +8138,116 @@
     </w:lvl>
   </w:abstractNum>
   <w:abstractNum w:abstractNumId="3">
+    <w:lvl w:ilvl="0">
+      <w:start w:val="1"/>
+      <w:numFmt w:val="decimal"/>
+      <w:lvlText w:val="%1."/>
+      <w:lvlJc w:val="left"/>
+      <w:pPr>
+        <w:ind w:left="720" w:hanging="360"/>
+      </w:pPr>
+      <w:rPr>
+        <w:u w:val="none"/>
+      </w:rPr>
+    </w:lvl>
+    <w:lvl w:ilvl="1">
+      <w:start w:val="1"/>
+      <w:numFmt w:val="lowerLetter"/>
+      <w:lvlText w:val="%2."/>
+      <w:lvlJc w:val="left"/>
+      <w:pPr>
+        <w:ind w:left="1440" w:hanging="360"/>
+      </w:pPr>
+      <w:rPr>
+        <w:u w:val="none"/>
+      </w:rPr>
+    </w:lvl>
+    <w:lvl w:ilvl="2">
+      <w:start w:val="1"/>
+      <w:numFmt w:val="lowerRoman"/>
+      <w:lvlText w:val="%3."/>
+      <w:lvlJc w:val="right"/>
+      <w:pPr>
+        <w:ind w:left="2160" w:hanging="360"/>
+      </w:pPr>
+      <w:rPr>
+        <w:u w:val="none"/>
+      </w:rPr>
+    </w:lvl>
+    <w:lvl w:ilvl="3">
+      <w:start w:val="1"/>
+      <w:numFmt w:val="decimal"/>
+      <w:lvlText w:val="%4."/>
+      <w:lvlJc w:val="left"/>
+      <w:pPr>
+        <w:ind w:left="2880" w:hanging="360"/>
+      </w:pPr>
+      <w:rPr>
+        <w:u w:val="none"/>
+      </w:rPr>
+    </w:lvl>
+    <w:lvl w:ilvl="4">
+      <w:start w:val="1"/>
+      <w:numFmt w:val="lowerLetter"/>
+      <w:lvlText w:val="%5."/>
+      <w:lvlJc w:val="left"/>
+      <w:pPr>
+        <w:ind w:left="3600" w:hanging="360"/>
+      </w:pPr>
+      <w:rPr>
+        <w:u w:val="none"/>
+      </w:rPr>
+    </w:lvl>
+    <w:lvl w:ilvl="5">
+      <w:start w:val="1"/>
+      <w:numFmt w:val="lowerRoman"/>
+      <w:lvlText w:val="%6."/>
+      <w:lvlJc w:val="right"/>
+      <w:pPr>
+        <w:ind w:left="4320" w:hanging="360"/>
+      </w:pPr>
+      <w:rPr>
+        <w:u w:val="none"/>
+      </w:rPr>
+    </w:lvl>
+    <w:lvl w:ilvl="6">
+      <w:start w:val="1"/>
+      <w:numFmt w:val="decimal"/>
+      <w:lvlText w:val="%7."/>
+      <w:lvlJc w:val="left"/>
+      <w:pPr>
+        <w:ind w:left="5040" w:hanging="360"/>
+      </w:pPr>
+      <w:rPr>
+        <w:u w:val="none"/>
+      </w:rPr>
+    </w:lvl>
+    <w:lvl w:ilvl="7">
+      <w:start w:val="1"/>
+      <w:numFmt w:val="lowerLetter"/>
+      <w:lvlText w:val="%8."/>
+      <w:lvlJc w:val="left"/>
+      <w:pPr>
+        <w:ind w:left="5760" w:hanging="360"/>
+      </w:pPr>
+      <w:rPr>
+        <w:u w:val="none"/>
+      </w:rPr>
+    </w:lvl>
+    <w:lvl w:ilvl="8">
+      <w:start w:val="1"/>
+      <w:numFmt w:val="lowerRoman"/>
+      <w:lvlText w:val="%9."/>
+      <w:lvlJc w:val="right"/>
+      <w:pPr>
+        <w:ind w:left="6480" w:hanging="360"/>
+      </w:pPr>
+      <w:rPr>
+        <w:u w:val="none"/>
+      </w:rPr>
+    </w:lvl>
+  </w:abstractNum>
+  <w:abstractNum w:abstractNumId="4">
     <w:lvl w:ilvl="0">
       <w:start w:val="1"/>
       <w:numFmt w:val="decimal"/>
@@ -8187,6 +8365,9 @@
   </w:num>
   <w:num w:numId="3">
     <w:abstractNumId w:val="3"/>
+  </w:num>
+  <w:num w:numId="4">
+    <w:abstractNumId w:val="4"/>
   </w:num>
 </w:numbering>
 </file>
@@ -8662,7 +8843,7 @@
 
 <file path=customXML/item1.xml><?xml version="1.0" encoding="utf-8"?>
 <go:gDocsCustomXmlDataStorage xmlns:go="http://customooxmlschemas.google.com/" xmlns:r="http://schemas.openxmlformats.org/officeDocument/2006/relationships" uri="GoogleDocsCustomDataVersion2">
-  <go:docsCustomData xmlns:go="http://customooxmlschemas.google.com/" roundtripDataSignature="AMtx7mht5vMDnMsu99HRzPydG39Tx0Aayw==">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</go:docsCustomData>
+  <go:docsCustomData xmlns:go="http://customooxmlschemas.google.com/" roundtripDataSignature="AMtx7mi6Y6RiwFnokzHNeJJ/HMUeQjZd6A==">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</go:docsCustomData>
 </go:gDocsCustomXmlDataStorage>
 </file>
 

</xml_diff>